<commit_message>
feat: add OCR tech scan document outputs (docx, pdf, pptx, xlsx)
Both ocr-handson/ and ocr-handson-h/ directories contain the full
OCR Technology Scan 2026 report converted into four professional
document formats with build scripts for reproducibility.

Co-Authored-By: Claude Opus 4.6 (1M context) <noreply@anthropic.com>
</commit_message>
<xml_diff>
--- a/ocr-handson/ocr_tech_scan.docx
+++ b/ocr-handson/ocr_tech_scan.docx
@@ -11768,7 +11768,7 @@
         </w:numPr>
         <w:spacing w:after="80"/>
       </w:pPr>
-      <w:hyperlink w:history="1" r:id="rIddaywvnct0i72rexijb4ql">
+      <w:hyperlink w:history="1" r:id="rId0y9vannuynwuaqye94jav">
         <w:r>
           <w:rPr>
             <w:rStyle w:val="Hyperlink"/>
@@ -11787,7 +11787,7 @@
         </w:numPr>
         <w:spacing w:after="80"/>
       </w:pPr>
-      <w:hyperlink w:history="1" r:id="rIdmhjihymfawdar6t7v4-xv">
+      <w:hyperlink w:history="1" r:id="rIdc-_kgi_kf-wpbioofjnai">
         <w:r>
           <w:rPr>
             <w:rStyle w:val="Hyperlink"/>
@@ -11806,7 +11806,7 @@
         </w:numPr>
         <w:spacing w:after="80"/>
       </w:pPr>
-      <w:hyperlink w:history="1" r:id="rIdnvdwpyid0cla_zpe5mu_d">
+      <w:hyperlink w:history="1" r:id="rId_ku6pgyjbgtzxtz53xo4t">
         <w:r>
           <w:rPr>
             <w:rStyle w:val="Hyperlink"/>
@@ -11825,7 +11825,7 @@
         </w:numPr>
         <w:spacing w:after="80"/>
       </w:pPr>
-      <w:hyperlink w:history="1" r:id="rId0mu1ppze3clqykhkkvcwp">
+      <w:hyperlink w:history="1" r:id="rId2y-e4h1dp02k9b3fx5lie">
         <w:r>
           <w:rPr>
             <w:rStyle w:val="Hyperlink"/>
@@ -11844,7 +11844,7 @@
         </w:numPr>
         <w:spacing w:after="80"/>
       </w:pPr>
-      <w:hyperlink w:history="1" r:id="rIdpxzf6ga5rgug8nqfh6dzj">
+      <w:hyperlink w:history="1" r:id="rIdeifqv0d5ue1av6rimqgui">
         <w:r>
           <w:rPr>
             <w:rStyle w:val="Hyperlink"/>
@@ -11863,7 +11863,7 @@
         </w:numPr>
         <w:spacing w:after="80"/>
       </w:pPr>
-      <w:hyperlink w:history="1" r:id="rIduqerf3yyfyadyjypa9uh8">
+      <w:hyperlink w:history="1" r:id="rIdiiky7oq76os-9h6xwvyst">
         <w:r>
           <w:rPr>
             <w:rStyle w:val="Hyperlink"/>
@@ -11882,7 +11882,7 @@
         </w:numPr>
         <w:spacing w:after="80"/>
       </w:pPr>
-      <w:hyperlink w:history="1" r:id="rIdxit76xnmlsdezhzkxrnsx">
+      <w:hyperlink w:history="1" r:id="rIdbc9lw_xqjgrr0jnaevask">
         <w:r>
           <w:rPr>
             <w:rStyle w:val="Hyperlink"/>
@@ -11901,7 +11901,7 @@
         </w:numPr>
         <w:spacing w:after="80"/>
       </w:pPr>
-      <w:hyperlink w:history="1" r:id="rId3ipf2tudj4_8fwjqpdevv">
+      <w:hyperlink w:history="1" r:id="rIdebmykjpnljdm68nnezrox">
         <w:r>
           <w:rPr>
             <w:rStyle w:val="Hyperlink"/>
@@ -11920,7 +11920,7 @@
         </w:numPr>
         <w:spacing w:after="80"/>
       </w:pPr>
-      <w:hyperlink w:history="1" r:id="rIdircwqp6fwbx4ylyeqbk6r">
+      <w:hyperlink w:history="1" r:id="rId5muhno5cthiaiazoywccl">
         <w:r>
           <w:rPr>
             <w:rStyle w:val="Hyperlink"/>
@@ -11939,7 +11939,7 @@
         </w:numPr>
         <w:spacing w:after="80"/>
       </w:pPr>
-      <w:hyperlink w:history="1" r:id="rIdvvt5nyl30xgbxts-oegeo">
+      <w:hyperlink w:history="1" r:id="rIdlxeersdxbhgsqvtu4lk4x">
         <w:r>
           <w:rPr>
             <w:rStyle w:val="Hyperlink"/>
@@ -11958,7 +11958,7 @@
         </w:numPr>
         <w:spacing w:after="80"/>
       </w:pPr>
-      <w:hyperlink w:history="1" r:id="rIdwxrrrzxcgcdhzl8r3skha">
+      <w:hyperlink w:history="1" r:id="rIdkxyj_agpk2zlsgdlmhdd7">
         <w:r>
           <w:rPr>
             <w:rStyle w:val="Hyperlink"/>
@@ -11977,7 +11977,7 @@
         </w:numPr>
         <w:spacing w:after="80"/>
       </w:pPr>
-      <w:hyperlink w:history="1" r:id="rIdr8q7hber4h-_hhrejxw3q">
+      <w:hyperlink w:history="1" r:id="rIdvxuingdgwgfbvra6uvx8f">
         <w:r>
           <w:rPr>
             <w:rStyle w:val="Hyperlink"/>
@@ -11996,7 +11996,7 @@
         </w:numPr>
         <w:spacing w:after="80"/>
       </w:pPr>
-      <w:hyperlink w:history="1" r:id="rIdqwqur7n7umvf0pggtxscn">
+      <w:hyperlink w:history="1" r:id="rIdngyqg56oajn3vx2flyhln">
         <w:r>
           <w:rPr>
             <w:rStyle w:val="Hyperlink"/>
@@ -12015,7 +12015,7 @@
         </w:numPr>
         <w:spacing w:after="80"/>
       </w:pPr>
-      <w:hyperlink w:history="1" r:id="rIdoze2pzu3lqccaatlw3zkn">
+      <w:hyperlink w:history="1" r:id="rIdh6ylql4j-qhkvby7zm_4p">
         <w:r>
           <w:rPr>
             <w:rStyle w:val="Hyperlink"/>
@@ -12034,7 +12034,7 @@
         </w:numPr>
         <w:spacing w:after="80"/>
       </w:pPr>
-      <w:hyperlink w:history="1" r:id="rIds3kjwnfzhrr3sd9pwhq-9">
+      <w:hyperlink w:history="1" r:id="rIdi7mal9mmhz3ujnsues1jq">
         <w:r>
           <w:rPr>
             <w:rStyle w:val="Hyperlink"/>
@@ -12053,7 +12053,7 @@
         </w:numPr>
         <w:spacing w:after="80"/>
       </w:pPr>
-      <w:hyperlink w:history="1" r:id="rId1k_9sezojfh89wldmf-f7">
+      <w:hyperlink w:history="1" r:id="rId5zqvt7dz_s3sjn9fzimyo">
         <w:r>
           <w:rPr>
             <w:rStyle w:val="Hyperlink"/>
@@ -12072,7 +12072,7 @@
         </w:numPr>
         <w:spacing w:after="80"/>
       </w:pPr>
-      <w:hyperlink w:history="1" r:id="rIdcn9ncfk2pybfjzubms4de">
+      <w:hyperlink w:history="1" r:id="rIdzqhcqdsliqh8duz_jn3kl">
         <w:r>
           <w:rPr>
             <w:rStyle w:val="Hyperlink"/>
@@ -12091,7 +12091,7 @@
         </w:numPr>
         <w:spacing w:after="80"/>
       </w:pPr>
-      <w:hyperlink w:history="1" r:id="rIdgu1b5_lp3qmcnrldi-quo">
+      <w:hyperlink w:history="1" r:id="rIdg4hpjkfeccb0zz0yhqab7">
         <w:r>
           <w:rPr>
             <w:rStyle w:val="Hyperlink"/>
@@ -12110,7 +12110,7 @@
         </w:numPr>
         <w:spacing w:after="80"/>
       </w:pPr>
-      <w:hyperlink w:history="1" r:id="rId4cf_vmpznt3tqxoim49kw">
+      <w:hyperlink w:history="1" r:id="rIddczsywnqrxojvvvyc_dob">
         <w:r>
           <w:rPr>
             <w:rStyle w:val="Hyperlink"/>
@@ -12129,7 +12129,7 @@
         </w:numPr>
         <w:spacing w:after="80"/>
       </w:pPr>
-      <w:hyperlink w:history="1" r:id="rIdtfgimosjj1rsvkpbsdvdd">
+      <w:hyperlink w:history="1" r:id="rIdtlt3rz5e-nhj26gzzizov">
         <w:r>
           <w:rPr>
             <w:rStyle w:val="Hyperlink"/>
@@ -12159,7 +12159,7 @@
         </w:numPr>
         <w:spacing w:after="80"/>
       </w:pPr>
-      <w:hyperlink w:history="1" r:id="rId9tkuhvhli-qp5opy1c6px">
+      <w:hyperlink w:history="1" r:id="rIdqhhbqq6ay-njm_rf6hzf6">
         <w:r>
           <w:rPr>
             <w:rStyle w:val="Hyperlink"/>
@@ -12178,7 +12178,7 @@
         </w:numPr>
         <w:spacing w:after="80"/>
       </w:pPr>
-      <w:hyperlink w:history="1" r:id="rIdd8t531xsir-ga8qztogjg">
+      <w:hyperlink w:history="1" r:id="rIdqsdhoapkd3xt2qvl_ys0p">
         <w:r>
           <w:rPr>
             <w:rStyle w:val="Hyperlink"/>
@@ -12197,7 +12197,7 @@
         </w:numPr>
         <w:spacing w:after="80"/>
       </w:pPr>
-      <w:hyperlink w:history="1" r:id="rId4stad7icspmf0di-7y_ov">
+      <w:hyperlink w:history="1" r:id="rIdupjcw0s-jo03vyupcznhj">
         <w:r>
           <w:rPr>
             <w:rStyle w:val="Hyperlink"/>
@@ -12216,7 +12216,7 @@
         </w:numPr>
         <w:spacing w:after="80"/>
       </w:pPr>
-      <w:hyperlink w:history="1" r:id="rIdvslo0gw7xcurt7loechvj">
+      <w:hyperlink w:history="1" r:id="rIdtenrdf77x2w0-zosj2hhm">
         <w:r>
           <w:rPr>
             <w:rStyle w:val="Hyperlink"/>
@@ -12235,7 +12235,7 @@
         </w:numPr>
         <w:spacing w:after="80"/>
       </w:pPr>
-      <w:hyperlink w:history="1" r:id="rIdkdpvswf8jje6qr0eqv13z">
+      <w:hyperlink w:history="1" r:id="rIdct6fr4wk_r5gf22cqnmpr">
         <w:r>
           <w:rPr>
             <w:rStyle w:val="Hyperlink"/>
@@ -12254,7 +12254,7 @@
         </w:numPr>
         <w:spacing w:after="80"/>
       </w:pPr>
-      <w:hyperlink w:history="1" r:id="rIdjy5yhpnpmtq9t213a5mek">
+      <w:hyperlink w:history="1" r:id="rIduwdkpkryclnyjyk6e2f2l">
         <w:r>
           <w:rPr>
             <w:rStyle w:val="Hyperlink"/>
@@ -12273,7 +12273,7 @@
         </w:numPr>
         <w:spacing w:after="80"/>
       </w:pPr>
-      <w:hyperlink w:history="1" r:id="rIddg-_tsio86gk8vrl9p3px">
+      <w:hyperlink w:history="1" r:id="rIdolfjcwjipgouneqmiput9">
         <w:r>
           <w:rPr>
             <w:rStyle w:val="Hyperlink"/>
@@ -12292,7 +12292,7 @@
         </w:numPr>
         <w:spacing w:after="80"/>
       </w:pPr>
-      <w:hyperlink w:history="1" r:id="rIdqssctr5pimh6ikkjlerk2">
+      <w:hyperlink w:history="1" r:id="rIdxgo_t_qkapobzi1pmdntl">
         <w:r>
           <w:rPr>
             <w:rStyle w:val="Hyperlink"/>
@@ -12311,7 +12311,7 @@
         </w:numPr>
         <w:spacing w:after="80"/>
       </w:pPr>
-      <w:hyperlink w:history="1" r:id="rIdv2p29frre-rp9ig3rjfac">
+      <w:hyperlink w:history="1" r:id="rIdja0bwgdx5_6j0ggkiqqtn">
         <w:r>
           <w:rPr>
             <w:rStyle w:val="Hyperlink"/>
@@ -12330,7 +12330,7 @@
         </w:numPr>
         <w:spacing w:after="80"/>
       </w:pPr>
-      <w:hyperlink w:history="1" r:id="rId9bvwhxik62jdx6mmu4h97">
+      <w:hyperlink w:history="1" r:id="rIdtxtj24pqgtfpn9krhgj_g">
         <w:r>
           <w:rPr>
             <w:rStyle w:val="Hyperlink"/>
@@ -12349,7 +12349,7 @@
         </w:numPr>
         <w:spacing w:after="80"/>
       </w:pPr>
-      <w:hyperlink w:history="1" r:id="rIdh_fwmqffe58vqucd802kw">
+      <w:hyperlink w:history="1" r:id="rIdez73y4yxru-zmgzynobgl">
         <w:r>
           <w:rPr>
             <w:rStyle w:val="Hyperlink"/>
@@ -12368,7 +12368,7 @@
         </w:numPr>
         <w:spacing w:after="80"/>
       </w:pPr>
-      <w:hyperlink w:history="1" r:id="rIdlxk2m_of1fn0yg5iw_coi">
+      <w:hyperlink w:history="1" r:id="rIdihzckgybbqckdp0p3v3kv">
         <w:r>
           <w:rPr>
             <w:rStyle w:val="Hyperlink"/>
@@ -12387,7 +12387,7 @@
         </w:numPr>
         <w:spacing w:after="80"/>
       </w:pPr>
-      <w:hyperlink w:history="1" r:id="rIdqahg32uag0piz1yu50ibh">
+      <w:hyperlink w:history="1" r:id="rIdlj_yc2ha91adparai236w">
         <w:r>
           <w:rPr>
             <w:rStyle w:val="Hyperlink"/>
@@ -12406,7 +12406,7 @@
         </w:numPr>
         <w:spacing w:after="80"/>
       </w:pPr>
-      <w:hyperlink w:history="1" r:id="rIdjsuyppaq2ihlqph41p1qb">
+      <w:hyperlink w:history="1" r:id="rIdih3rpe7ukq40mv5npr4ya">
         <w:r>
           <w:rPr>
             <w:rStyle w:val="Hyperlink"/>
@@ -12425,7 +12425,7 @@
         </w:numPr>
         <w:spacing w:after="80"/>
       </w:pPr>
-      <w:hyperlink w:history="1" r:id="rIdusndglygmpvqutledswax">
+      <w:hyperlink w:history="1" r:id="rIdf4o9rt98iy2pgi8ugc_vv">
         <w:r>
           <w:rPr>
             <w:rStyle w:val="Hyperlink"/>
@@ -12444,7 +12444,7 @@
         </w:numPr>
         <w:spacing w:after="80"/>
       </w:pPr>
-      <w:hyperlink w:history="1" r:id="rId0ozutcc1dcgigqywl5ikx">
+      <w:hyperlink w:history="1" r:id="rIdcpuxqkb96r3wlhogi1w3-">
         <w:r>
           <w:rPr>
             <w:rStyle w:val="Hyperlink"/>
@@ -12463,7 +12463,7 @@
         </w:numPr>
         <w:spacing w:after="80"/>
       </w:pPr>
-      <w:hyperlink w:history="1" r:id="rId76p6vb7b7hmxgbgjr4c_e">
+      <w:hyperlink w:history="1" r:id="rIdfygpgvsfuzgypjtladmpr">
         <w:r>
           <w:rPr>
             <w:rStyle w:val="Hyperlink"/>
@@ -12482,7 +12482,7 @@
         </w:numPr>
         <w:spacing w:after="80"/>
       </w:pPr>
-      <w:hyperlink w:history="1" r:id="rIdu6ytnuat7k031ijh20a8p">
+      <w:hyperlink w:history="1" r:id="rIdwds3y9evla4l6s_k2i5k8">
         <w:r>
           <w:rPr>
             <w:rStyle w:val="Hyperlink"/>
@@ -12501,7 +12501,7 @@
         </w:numPr>
         <w:spacing w:after="80"/>
       </w:pPr>
-      <w:hyperlink w:history="1" r:id="rIddcvi1cg57ddgn93tr-fsy">
+      <w:hyperlink w:history="1" r:id="rIdcnbqvqifaxiihmrdms5se">
         <w:r>
           <w:rPr>
             <w:rStyle w:val="Hyperlink"/>
@@ -12520,7 +12520,7 @@
         </w:numPr>
         <w:spacing w:after="80"/>
       </w:pPr>
-      <w:hyperlink w:history="1" r:id="rIds9lqryftj7o2-cwsgzgge">
+      <w:hyperlink w:history="1" r:id="rIdl6igcdqm_dqevbktrpc82">
         <w:r>
           <w:rPr>
             <w:rStyle w:val="Hyperlink"/>
@@ -12539,7 +12539,7 @@
         </w:numPr>
         <w:spacing w:after="80"/>
       </w:pPr>
-      <w:hyperlink w:history="1" r:id="rIdmlgtdszqzjwrv6tavbumu">
+      <w:hyperlink w:history="1" r:id="rIdw5bzyg6q-6db6hddvrtd0">
         <w:r>
           <w:rPr>
             <w:rStyle w:val="Hyperlink"/>
@@ -12558,7 +12558,7 @@
         </w:numPr>
         <w:spacing w:after="80"/>
       </w:pPr>
-      <w:hyperlink w:history="1" r:id="rIdxdx5mwm_ofs5sya43y0ck">
+      <w:hyperlink w:history="1" r:id="rIdy1dwbl_xgnvklmqnuxjua">
         <w:r>
           <w:rPr>
             <w:rStyle w:val="Hyperlink"/>
@@ -12577,7 +12577,7 @@
         </w:numPr>
         <w:spacing w:after="80"/>
       </w:pPr>
-      <w:hyperlink w:history="1" r:id="rIddwans08vur94xw0xwmbdf">
+      <w:hyperlink w:history="1" r:id="rIdubpn5kjnb5ivlxbuwjlir">
         <w:r>
           <w:rPr>
             <w:rStyle w:val="Hyperlink"/>
@@ -12596,7 +12596,7 @@
         </w:numPr>
         <w:spacing w:after="80"/>
       </w:pPr>
-      <w:hyperlink w:history="1" r:id="rIdhagz0h-e2vse6pyf4fp5k">
+      <w:hyperlink w:history="1" r:id="rId97wcl1doupruk19y_2vvf">
         <w:r>
           <w:rPr>
             <w:rStyle w:val="Hyperlink"/>
@@ -12626,7 +12626,7 @@
         </w:numPr>
         <w:spacing w:after="80"/>
       </w:pPr>
-      <w:hyperlink w:history="1" r:id="rIddhpl3axhpsncgutixwzdb">
+      <w:hyperlink w:history="1" r:id="rIdtvsnbnloskrbklpvlokea">
         <w:r>
           <w:rPr>
             <w:rStyle w:val="Hyperlink"/>
@@ -12645,7 +12645,7 @@
         </w:numPr>
         <w:spacing w:after="80"/>
       </w:pPr>
-      <w:hyperlink w:history="1" r:id="rId0mgd3p0u4xllcan-ixslp">
+      <w:hyperlink w:history="1" r:id="rIdp92o0fakkumw_gwrpjqcx">
         <w:r>
           <w:rPr>
             <w:rStyle w:val="Hyperlink"/>
@@ -12664,7 +12664,7 @@
         </w:numPr>
         <w:spacing w:after="80"/>
       </w:pPr>
-      <w:hyperlink w:history="1" r:id="rId7gh4sj0gs9toclicjd2dq">
+      <w:hyperlink w:history="1" r:id="rIdyoyczaf6q4ngghidyetot">
         <w:r>
           <w:rPr>
             <w:rStyle w:val="Hyperlink"/>
@@ -12683,7 +12683,7 @@
         </w:numPr>
         <w:spacing w:after="80"/>
       </w:pPr>
-      <w:hyperlink w:history="1" r:id="rIdxq2peuk28p7ebbdo0uiwd">
+      <w:hyperlink w:history="1" r:id="rIddiwl_f3ghut8tueeiifwk">
         <w:r>
           <w:rPr>
             <w:rStyle w:val="Hyperlink"/>
@@ -12702,7 +12702,7 @@
         </w:numPr>
         <w:spacing w:after="80"/>
       </w:pPr>
-      <w:hyperlink w:history="1" r:id="rIdhq1srmeucbzl6e09x6yh-">
+      <w:hyperlink w:history="1" r:id="rIdvzvmec-rc-jce8yf84sb_">
         <w:r>
           <w:rPr>
             <w:rStyle w:val="Hyperlink"/>
@@ -12721,7 +12721,7 @@
         </w:numPr>
         <w:spacing w:after="80"/>
       </w:pPr>
-      <w:hyperlink w:history="1" r:id="rIdeqfmctdvhftbbku9adjxx">
+      <w:hyperlink w:history="1" r:id="rIdpddfray0e1o9ncgmoes8c">
         <w:r>
           <w:rPr>
             <w:rStyle w:val="Hyperlink"/>
@@ -12740,7 +12740,7 @@
         </w:numPr>
         <w:spacing w:after="80"/>
       </w:pPr>
-      <w:hyperlink w:history="1" r:id="rIdiegnnjudkgmhhprx63ey4">
+      <w:hyperlink w:history="1" r:id="rIdgxyzs9dzxyqyd1-vuqwgb">
         <w:r>
           <w:rPr>
             <w:rStyle w:val="Hyperlink"/>
@@ -12759,7 +12759,7 @@
         </w:numPr>
         <w:spacing w:after="80"/>
       </w:pPr>
-      <w:hyperlink w:history="1" r:id="rIdkky4pssh_tmmjtrqwmbr0">
+      <w:hyperlink w:history="1" r:id="rIdxm0pkfe9bo3p1ht7jeiya">
         <w:r>
           <w:rPr>
             <w:rStyle w:val="Hyperlink"/>
@@ -12778,7 +12778,7 @@
         </w:numPr>
         <w:spacing w:after="80"/>
       </w:pPr>
-      <w:hyperlink w:history="1" r:id="rIddcbyouzz8zklkof4e0vzd">
+      <w:hyperlink w:history="1" r:id="rIdz-ty-fnfts5kn7txjivdg">
         <w:r>
           <w:rPr>
             <w:rStyle w:val="Hyperlink"/>
@@ -12797,7 +12797,7 @@
         </w:numPr>
         <w:spacing w:after="80"/>
       </w:pPr>
-      <w:hyperlink w:history="1" r:id="rIdohcv0wvdz1yo4o0vfugpf">
+      <w:hyperlink w:history="1" r:id="rIdjinhydnm5vdmd3vq9bj8n">
         <w:r>
           <w:rPr>
             <w:rStyle w:val="Hyperlink"/>
@@ -12816,7 +12816,7 @@
         </w:numPr>
         <w:spacing w:after="80"/>
       </w:pPr>
-      <w:hyperlink w:history="1" r:id="rIdx5vp0qyjkbkcpquljodqr">
+      <w:hyperlink w:history="1" r:id="rIdz0ya5rhsva85osvjseodk">
         <w:r>
           <w:rPr>
             <w:rStyle w:val="Hyperlink"/>
@@ -12835,7 +12835,7 @@
         </w:numPr>
         <w:spacing w:after="80"/>
       </w:pPr>
-      <w:hyperlink w:history="1" r:id="rIdxrstg_w0m8hz0y5fmgzr9">
+      <w:hyperlink w:history="1" r:id="rIdunnwgf9p_aez_ti1y0gjw">
         <w:r>
           <w:rPr>
             <w:rStyle w:val="Hyperlink"/>
@@ -12854,7 +12854,7 @@
         </w:numPr>
         <w:spacing w:after="80"/>
       </w:pPr>
-      <w:hyperlink w:history="1" r:id="rIdcnhowal2rpb-pqmeicptd">
+      <w:hyperlink w:history="1" r:id="rId2p4vdwiorlevzdlvgacdk">
         <w:r>
           <w:rPr>
             <w:rStyle w:val="Hyperlink"/>
@@ -12873,7 +12873,7 @@
         </w:numPr>
         <w:spacing w:after="80"/>
       </w:pPr>
-      <w:hyperlink w:history="1" r:id="rIdtw6vhjfodtb0rmgnjfktz">
+      <w:hyperlink w:history="1" r:id="rIdv0y2czwcquyazyx6wpgrv">
         <w:r>
           <w:rPr>
             <w:rStyle w:val="Hyperlink"/>
@@ -12892,7 +12892,7 @@
         </w:numPr>
         <w:spacing w:after="80"/>
       </w:pPr>
-      <w:hyperlink w:history="1" r:id="rIda65rl75ogxp535vcitc0v">
+      <w:hyperlink w:history="1" r:id="rIdm0cqry84njqe1an4lk3cq">
         <w:r>
           <w:rPr>
             <w:rStyle w:val="Hyperlink"/>
@@ -12911,7 +12911,7 @@
         </w:numPr>
         <w:spacing w:after="80"/>
       </w:pPr>
-      <w:hyperlink w:history="1" r:id="rIdrpcajg1ut9ma4s2acveap">
+      <w:hyperlink w:history="1" r:id="rIdyxwb21ocxdisxh5-3v9wr">
         <w:r>
           <w:rPr>
             <w:rStyle w:val="Hyperlink"/>
@@ -12930,7 +12930,7 @@
         </w:numPr>
         <w:spacing w:after="80"/>
       </w:pPr>
-      <w:hyperlink w:history="1" r:id="rIdskbstznxi15xr-ypfzl34">
+      <w:hyperlink w:history="1" r:id="rId12renz1urek4lxqa39os1">
         <w:r>
           <w:rPr>
             <w:rStyle w:val="Hyperlink"/>
@@ -12949,7 +12949,7 @@
         </w:numPr>
         <w:spacing w:after="80"/>
       </w:pPr>
-      <w:hyperlink w:history="1" r:id="rIdfiznbtntuinpr8lk67rpd">
+      <w:hyperlink w:history="1" r:id="rIdxuzmurrobav8u1i8-wrwj">
         <w:r>
           <w:rPr>
             <w:rStyle w:val="Hyperlink"/>
@@ -12968,7 +12968,7 @@
         </w:numPr>
         <w:spacing w:after="80"/>
       </w:pPr>
-      <w:hyperlink w:history="1" r:id="rIdwlfcykolir4rxpxhwhrlu">
+      <w:hyperlink w:history="1" r:id="rIdpcqtig6t5ueax-5kijofl">
         <w:r>
           <w:rPr>
             <w:rStyle w:val="Hyperlink"/>
@@ -12998,7 +12998,7 @@
         </w:numPr>
         <w:spacing w:after="80"/>
       </w:pPr>
-      <w:hyperlink w:history="1" r:id="rIdgpqqud1z6rbbhmggtzbzp">
+      <w:hyperlink w:history="1" r:id="rIdbatetipd6gnasy6pon8qi">
         <w:r>
           <w:rPr>
             <w:rStyle w:val="Hyperlink"/>
@@ -13017,7 +13017,7 @@
         </w:numPr>
         <w:spacing w:after="80"/>
       </w:pPr>
-      <w:hyperlink w:history="1" r:id="rIdo96kzifbezkccigw2skme">
+      <w:hyperlink w:history="1" r:id="rIdzmmuwl1utcmccj3flx8ap">
         <w:r>
           <w:rPr>
             <w:rStyle w:val="Hyperlink"/>
@@ -13036,7 +13036,7 @@
         </w:numPr>
         <w:spacing w:after="80"/>
       </w:pPr>
-      <w:hyperlink w:history="1" r:id="rIdyaqy12wr18xce85kfrxbv">
+      <w:hyperlink w:history="1" r:id="rIdacchw9h_g1tsrp02bhbfl">
         <w:r>
           <w:rPr>
             <w:rStyle w:val="Hyperlink"/>
@@ -13055,7 +13055,7 @@
         </w:numPr>
         <w:spacing w:after="80"/>
       </w:pPr>
-      <w:hyperlink w:history="1" r:id="rIdxrmku9uajupeldaoxdcv4">
+      <w:hyperlink w:history="1" r:id="rId0gy-x50g9xeywvfbjakpt">
         <w:r>
           <w:rPr>
             <w:rStyle w:val="Hyperlink"/>
@@ -13074,7 +13074,7 @@
         </w:numPr>
         <w:spacing w:after="80"/>
       </w:pPr>
-      <w:hyperlink w:history="1" r:id="rIdxhk-d4vl0n6llfmjrhjst">
+      <w:hyperlink w:history="1" r:id="rIdiuqcq7hd53lvq4ktvwn9x">
         <w:r>
           <w:rPr>
             <w:rStyle w:val="Hyperlink"/>
@@ -13093,7 +13093,7 @@
         </w:numPr>
         <w:spacing w:after="80"/>
       </w:pPr>
-      <w:hyperlink w:history="1" r:id="rIdsj1l-wtwbv12-0jx7q7ao">
+      <w:hyperlink w:history="1" r:id="rIdoi0hup_6zjh0zuc3fufkq">
         <w:r>
           <w:rPr>
             <w:rStyle w:val="Hyperlink"/>
@@ -13112,7 +13112,7 @@
         </w:numPr>
         <w:spacing w:after="80"/>
       </w:pPr>
-      <w:hyperlink w:history="1" r:id="rIdnp3txejzyf_0uyfqpidir">
+      <w:hyperlink w:history="1" r:id="rId_-o_sqouvg9qpj1qkmpm0">
         <w:r>
           <w:rPr>
             <w:rStyle w:val="Hyperlink"/>
@@ -13131,7 +13131,7 @@
         </w:numPr>
         <w:spacing w:after="80"/>
       </w:pPr>
-      <w:hyperlink w:history="1" r:id="rIdrnsinpem4lhacyopk-z5f">
+      <w:hyperlink w:history="1" r:id="rIdwzq7g2vhj9sf1mgks-bzx">
         <w:r>
           <w:rPr>
             <w:rStyle w:val="Hyperlink"/>
@@ -13150,7 +13150,7 @@
         </w:numPr>
         <w:spacing w:after="80"/>
       </w:pPr>
-      <w:hyperlink w:history="1" r:id="rIdmrpof-uwkkmlpzbk44xvd">
+      <w:hyperlink w:history="1" r:id="rIdl7lvlnspxzvyuxkztqcuq">
         <w:r>
           <w:rPr>
             <w:rStyle w:val="Hyperlink"/>
@@ -13169,7 +13169,7 @@
         </w:numPr>
         <w:spacing w:after="80"/>
       </w:pPr>
-      <w:hyperlink w:history="1" r:id="rIdzhajbz1fo5mrprzbr8ajm">
+      <w:hyperlink w:history="1" r:id="rIdlbyuggtje5hustqawxggf">
         <w:r>
           <w:rPr>
             <w:rStyle w:val="Hyperlink"/>
@@ -13188,7 +13188,7 @@
         </w:numPr>
         <w:spacing w:after="80"/>
       </w:pPr>
-      <w:hyperlink w:history="1" r:id="rIdw1olouef8tjdk8c9w6a3j">
+      <w:hyperlink w:history="1" r:id="rIdyz7v5dyki5qwrz0zv0ulf">
         <w:r>
           <w:rPr>
             <w:rStyle w:val="Hyperlink"/>
@@ -13207,7 +13207,7 @@
         </w:numPr>
         <w:spacing w:after="80"/>
       </w:pPr>
-      <w:hyperlink w:history="1" r:id="rId9gdw_m0ofs6num5u1zqfe">
+      <w:hyperlink w:history="1" r:id="rIdk7xrnbhck6dmqxf8wrdij">
         <w:r>
           <w:rPr>
             <w:rStyle w:val="Hyperlink"/>
@@ -13226,7 +13226,7 @@
         </w:numPr>
         <w:spacing w:after="80"/>
       </w:pPr>
-      <w:hyperlink w:history="1" r:id="rIdcayvjkwivettxhia-ulct">
+      <w:hyperlink w:history="1" r:id="rId8bcuqiice09ohuv-78tjs">
         <w:r>
           <w:rPr>
             <w:rStyle w:val="Hyperlink"/>
@@ -13245,7 +13245,7 @@
         </w:numPr>
         <w:spacing w:after="80"/>
       </w:pPr>
-      <w:hyperlink w:history="1" r:id="rIdijhe4vtf9mr_vnrkgu7ae">
+      <w:hyperlink w:history="1" r:id="rIdmyiey0souv11dqkudyc47">
         <w:r>
           <w:rPr>
             <w:rStyle w:val="Hyperlink"/>
@@ -13264,7 +13264,7 @@
         </w:numPr>
         <w:spacing w:after="80"/>
       </w:pPr>
-      <w:hyperlink w:history="1" r:id="rId6staj_wbbgejzjlhpy-jz">
+      <w:hyperlink w:history="1" r:id="rIdtynaj-sugtcwh6dbu62qi">
         <w:r>
           <w:rPr>
             <w:rStyle w:val="Hyperlink"/>
@@ -13283,7 +13283,7 @@
         </w:numPr>
         <w:spacing w:after="80"/>
       </w:pPr>
-      <w:hyperlink w:history="1" r:id="rIdg30ylsng7nstgswgx_o4u">
+      <w:hyperlink w:history="1" r:id="rIdvlagx3ukpc9hk8rgqmlp4">
         <w:r>
           <w:rPr>
             <w:rStyle w:val="Hyperlink"/>
@@ -13302,7 +13302,7 @@
         </w:numPr>
         <w:spacing w:after="80"/>
       </w:pPr>
-      <w:hyperlink w:history="1" r:id="rId98x5hbll_7buaawfht_nl">
+      <w:hyperlink w:history="1" r:id="rIdsxwcbpdii17_oy6aoibkd">
         <w:r>
           <w:rPr>
             <w:rStyle w:val="Hyperlink"/>
@@ -13321,7 +13321,7 @@
         </w:numPr>
         <w:spacing w:after="80"/>
       </w:pPr>
-      <w:hyperlink w:history="1" r:id="rId5tc2yas_gwct5divxg5ez">
+      <w:hyperlink w:history="1" r:id="rIdeuprqwgxeawj299qm6dqo">
         <w:r>
           <w:rPr>
             <w:rStyle w:val="Hyperlink"/>
@@ -13340,7 +13340,7 @@
         </w:numPr>
         <w:spacing w:after="80"/>
       </w:pPr>
-      <w:hyperlink w:history="1" r:id="rIdqfv2my95rxab4twbuyfau">
+      <w:hyperlink w:history="1" r:id="rId0rhchgjip-tvf1wlciky6">
         <w:r>
           <w:rPr>
             <w:rStyle w:val="Hyperlink"/>
@@ -13359,7 +13359,7 @@
         </w:numPr>
         <w:spacing w:after="80"/>
       </w:pPr>
-      <w:hyperlink w:history="1" r:id="rIdoggjo4brcpa8dxieuv5df">
+      <w:hyperlink w:history="1" r:id="rIduxspcyvqfkufndky3cutc">
         <w:r>
           <w:rPr>
             <w:rStyle w:val="Hyperlink"/>
@@ -13378,7 +13378,7 @@
         </w:numPr>
         <w:spacing w:after="80"/>
       </w:pPr>
-      <w:hyperlink w:history="1" r:id="rIdtal1waxgofois04sdpl7d">
+      <w:hyperlink w:history="1" r:id="rId_tttffmijok6ixm_1ozez">
         <w:r>
           <w:rPr>
             <w:rStyle w:val="Hyperlink"/>
@@ -13397,7 +13397,7 @@
         </w:numPr>
         <w:spacing w:after="80"/>
       </w:pPr>
-      <w:hyperlink w:history="1" r:id="rIdyto9tcfs8kcxtqnhvirp6">
+      <w:hyperlink w:history="1" r:id="rIdw_pd6_l94ezjdxcjakbql">
         <w:r>
           <w:rPr>
             <w:rStyle w:val="Hyperlink"/>
@@ -13416,7 +13416,7 @@
         </w:numPr>
         <w:spacing w:after="80"/>
       </w:pPr>
-      <w:hyperlink w:history="1" r:id="rId_fhrzsmz-pnqthoboxfbb">
+      <w:hyperlink w:history="1" r:id="rIdaybekr4amv70xufajfpcr">
         <w:r>
           <w:rPr>
             <w:rStyle w:val="Hyperlink"/>
@@ -13435,7 +13435,7 @@
         </w:numPr>
         <w:spacing w:after="80"/>
       </w:pPr>
-      <w:hyperlink w:history="1" r:id="rIdz0ycrtoilaxbqs1fb-l20">
+      <w:hyperlink w:history="1" r:id="rIds5xdj8miso7yrevujrgaz">
         <w:r>
           <w:rPr>
             <w:rStyle w:val="Hyperlink"/>
@@ -13454,7 +13454,7 @@
         </w:numPr>
         <w:spacing w:after="80"/>
       </w:pPr>
-      <w:hyperlink w:history="1" r:id="rIde6oiis-bzi733z9ai-ynh">
+      <w:hyperlink w:history="1" r:id="rId5ti-3ennuckdo6r9un7jp">
         <w:r>
           <w:rPr>
             <w:rStyle w:val="Hyperlink"/>
@@ -13473,7 +13473,7 @@
         </w:numPr>
         <w:spacing w:after="80"/>
       </w:pPr>
-      <w:hyperlink w:history="1" r:id="rIdhygjz3xm0ntjdveodpvxv">
+      <w:hyperlink w:history="1" r:id="rIdblkb0leuh-ak0qqc498ll">
         <w:r>
           <w:rPr>
             <w:rStyle w:val="Hyperlink"/>
@@ -13492,7 +13492,7 @@
         </w:numPr>
         <w:spacing w:after="80"/>
       </w:pPr>
-      <w:hyperlink w:history="1" r:id="rIdb1rokzmz6ldjfb9qv-xx9">
+      <w:hyperlink w:history="1" r:id="rId3cj89syx75ujqg7okd1fm">
         <w:r>
           <w:rPr>
             <w:rStyle w:val="Hyperlink"/>

</xml_diff>